<commit_message>
feat: Epic B - Data Collection complete
Implemented data collection pipeline from MCP servers:

Collectors:
- PerplexityCollector: Queries Perplexity MCP for real-time web research
  - Async/await support via Anthropic client
  - Authentication & connection handling
  - JSON parsing of findings with scoring

- Project10Collector: Queries Project 10 knowledge system MCP
  - Async queries to internal knowledge base
  - Maintains credibility=1.0 for internal insights
  - Parallel execution with Perplexity

- DataCollectionOrchestrator: Manages parallel collection
  - Validates both connections before running
  - Collects from web and KB simultaneously
  - Optional knowledge base inclusion
  - Returns unified Research object

Testing:
- 13 new collector tests (all async)
- Happy path + error handling for both sources
- Orchestrator tests with async mocking
- 15 total tests passing

Next: Epic C (Data Processing - rank, deduplicate, organize)
</commit_message>
<xml_diff>
--- a/PROJECT_PLAN.docx
+++ b/PROJECT_PLAN.docx
@@ -469,7 +469,7 @@
           </w:tcPr>
           <w:p>
             <w:r>
-              <w:t>🔲</w:t>
+              <w:t>✅</w:t>
             </w:r>
           </w:p>
         </w:tc>
@@ -501,7 +501,7 @@
           </w:tcPr>
           <w:p>
             <w:r>
-              <w:t>🔲</w:t>
+              <w:t>✅</w:t>
             </w:r>
           </w:p>
         </w:tc>
@@ -533,7 +533,7 @@
           </w:tcPr>
           <w:p>
             <w:r>
-              <w:t>🔲</w:t>
+              <w:t>✅</w:t>
             </w:r>
           </w:p>
         </w:tc>
@@ -565,7 +565,7 @@
           </w:tcPr>
           <w:p>
             <w:r>
-              <w:t>🔲</w:t>
+              <w:t>✅</w:t>
             </w:r>
           </w:p>
         </w:tc>
@@ -1346,6 +1346,9 @@
     </w:p>
     <w:p>
       <w:r>
+        <w:t>2026-07-30: Epic B Data Collection complete. Perplexity &amp; Project 10 MCP collectors implemented with async support, orchestrator for parallel collection, 13 tests passing.</w:t>
+        <w:br/>
+        <w:br/>
         <w:t>2026-07-30: Epic A Foundation complete. Project scaffolding, dependencies, CLI, tests, and documentation skeletons ready.</w:t>
       </w:r>
     </w:p>

</xml_diff>